<commit_message>
Update application demo presentation
</commit_message>
<xml_diff>
--- a/public/documents/openai-2026-06-02/01_AI_Deployment_Engineer_Codex_Remote_US/Jonathan_Yu_AI_Deployment_Engineer_Codex_Cover_Letter.docx
+++ b/public/documents/openai-2026-06-02/01_AI_Deployment_Engineer_Codex_Remote_US/Jonathan_Yu_AI_Deployment_Engineer_Codex_Cover_Letter.docx
@@ -93,9 +93,10 @@
       <w:pPr/>
       <w:r>
         <w:rPr/>
-        <w:t xml:space="preserve">My strongest evidence is the work behind Sip Studies and Sipopedia. I built a React, TypeScript, Vite, Supabase, Stripe, and Edge Function platform across learning, tasting, maps, terminology, AI/news workflows, events, and paid access. I also created a 20,000-row Sipopedia terminology pipeline with citation, review, and source metadata, plus automation and validation patterns that make the system easier to maintain. That work is directly relevant to teams that need clear learning paths, practical demos, adoption programs, technical writing, and customer-facing enablement.</w:t>
-      </w:r>
-    </w:p>
+        <w:t xml:space="preserve">My strongest evidence is the work behind Sip Studies and Sipopedia. Using advanced prompting, durable goals/threads, and repo-driven AI agent workflows, I built a practical product across React, TypeScript, Vite, Supabase, Stripe, and Edge Functions for learning, tasting, maps, terminology, AI/news routing, events, and paid access. I also created a 20,000-row Sipopedia terminology pipeline with citation, review, and source metadata, plus automation and validation patterns that make the system easier to maintain. That work is directly relevant to teams that need clear learning paths, practical demos, adoption programs, technical writing, and customer-facing enablement.</w:t>
+      </w:r>
+    </w:p>
+    <w:p/>
     <w:p/>
     <w:p>
       <w:pPr/>
@@ -117,7 +118,7 @@
       <w:pPr/>
       <w:r>
         <w:rPr/>
-        <w:t xml:space="preserve">Thank you for considering my application. I would welcome the chance to discuss how my love of artificial intelligence has revolutionized my productivity and capabilities in a way that carved a path for me to build an educational platform, empower others' enablement, and how my hands-on product building can support OpenAI's Codex deployment and adoption goals.</w:t>
+        <w:t xml:space="preserve">Thank you for considering my application. I would welcome the chance to discuss how my love of artificial intelligence has revolutionized my productivity and capabilities in a way that carved a path for me to build an educational platform, support customer enablement, and apply hands-on AI-assisted product building to OpenAI's Codex deployment and adoption goals.</w:t>
       </w:r>
     </w:p>
     <w:p/>

</xml_diff>